<commit_message>
scopus: write down what the three fixes measured
STATUS.md gets an entry per issue with the numbers behind it, the QA-set
regression check for the rotated pass, and the two suite results on the shipped
binary (integration 65/0/0/1, per-command 45/0/4).

Two bench notes corrected while there. SWD works again and is the only remote
way back from a wedged console, so the note saying the boot switch blocks it is
gone. And when the whole D/I/J group of the integration suite fails at once,
read the modem's log first: "UartFilter: no terminator from modem after 5000ms"
means the module's own AT interface, not the link. That cost a first run of
41 PASS / 10 FAIL with the camera entirely innocent; a modem reboot cleared it.

The tester manual gains the mask decode in its expected output, a note telling
the tester to read the on/off lines, and what the vehicle bits are in both
settings. mdm stats in it gains the ring counters.
</commit_message>
<xml_diff>
--- a/scopus/Scopus_Tester_Manual.docx
+++ b/scopus/Scopus_Tester_Manual.docx
@@ -20,7 +20,7 @@
     </w:p>
     <w:p>
       <w:r>
-        <w:t>Generated 2026-09-02 from scopus/make_tester_manual.py. Every command below was run, in this order, on the bench PC this document is written for, and each “Expected” block is the output that came back. The one exception is Step 9, which needs a person standing in front of the camera; its example is a real live detection recorded on the same bench.</w:t>
+        <w:t>Generated 2026-09-04 from scopus/make_tester_manual.py. Every command below was run, in this order, on the bench PC this document is written for, and each “Expected” block is the output that came back. The one exception is Step 9, which needs a person standing in front of the camera; its example is a real live detection recorded on the same bench.</w:t>
       </w:r>
     </w:p>
     <w:p>
@@ -1398,6 +1398,10 @@
         <w:br/>
         <w:t>notify enable: 0x000000ff</w:t>
         <w:br/>
+        <w:t xml:space="preserve">  on : netreg motion-start motion-stop periodic people vehicle</w:t>
+        <w:br/>
+        <w:t xml:space="preserve">  off: (nothing)</w:t>
+        <w:br/>
         <w:t>notify enable ok</w:t>
       </w:r>
     </w:p>
@@ -1451,7 +1455,7 @@
           </w:tcPr>
           <w:p>
             <w:r>
-              <w:t>look for people (0x01); when you find some, both save a picture to the SD card and report it (0x03). The 'report' half is what makes an event reach this PC — with it off the camera detects silently</w:t>
+              <w:t>look for people (0x01); when you find some, both save a picture to the SD card and report it (0x03). The 'report' half is what makes an event reach this PC. With it off the camera detects silently</w:t>
             </w:r>
           </w:p>
         </w:tc>
@@ -1490,7 +1494,35 @@
           <w:color w:val="444444"/>
           <w:sz w:val="18"/>
         </w:rPr>
-        <w:t>These two settings go back to their defaults if the camera restarts. If a later step stops producing events, come back and run these two again — see section 15.</w:t>
+        <w:t>The two lines under 'notify enable' say which events the camera will report and which it will keep to itself. Read them. A kind of event that is on the 'off' line will be detected, photographed and never reported, and nothing later in this test will tell you why.</w:t>
+      </w:r>
+    </w:p>
+    <w:p/>
+    <w:p>
+      <w:pPr>
+        <w:ind w:left="432"/>
+      </w:pPr>
+      <w:r>
+        <w:rPr>
+          <w:i/>
+          <w:color w:val="444444"/>
+          <w:sz w:val="18"/>
+        </w:rPr>
+        <w:t>To look for vehicles as well, use 'detect profile 0x03 0x03' and make sure 'vehicle' is on the 'on' line above. Vehicles are a separate bit in both settings: 0x02 in the detect profile and 0x20 in the notify mask. Setting one without the other is the commonest way to end up with pictures of cars and no notifications about them, and the camera now warns you when you do it.</w:t>
+      </w:r>
+    </w:p>
+    <w:p/>
+    <w:p>
+      <w:pPr>
+        <w:ind w:left="432"/>
+      </w:pPr>
+      <w:r>
+        <w:rPr>
+          <w:i/>
+          <w:color w:val="444444"/>
+          <w:sz w:val="18"/>
+        </w:rPr>
+        <w:t>These two settings go back to their defaults if the camera restarts. If a later step stops producing events, come back and run these two again, see section 15.</w:t>
       </w:r>
     </w:p>
     <w:p>
@@ -3819,6 +3851,8 @@
         <w:t>ntf: queued=3 sent=3 unconfirmed=0 dropped=0</w:t>
         <w:br/>
         <w:t>link: relinks=3 consec_timeouts=0</w:t>
+        <w:br/>
+        <w:t>ring: on (continuous DMA + 16-byte FIFO)  bytes=990 lost=0 peak=11/1024 restarts=0</w:t>
       </w:r>
     </w:p>
     <w:tbl>
@@ -3959,6 +3993,50 @@
           <w:p>
             <w:r>
               <w:t>corruption on the internal cable. A clean link reports 0 badcrc.</w:t>
+            </w:r>
+          </w:p>
+        </w:tc>
+      </w:tr>
+      <w:tr>
+        <w:tc>
+          <w:tcPr>
+            <w:tcW w:type="dxa" w:w="4320"/>
+          </w:tcPr>
+          <w:p>
+            <w:r>
+              <w:t>ring: lost</w:t>
+            </w:r>
+          </w:p>
+        </w:tc>
+        <w:tc>
+          <w:tcPr>
+            <w:tcW w:type="dxa" w:w="4320"/>
+          </w:tcPr>
+          <w:p>
+            <w:r>
+              <w:t>bytes the camera received and never got to read. Must be 0. Anything else is worth reporting.</w:t>
+            </w:r>
+          </w:p>
+        </w:tc>
+      </w:tr>
+      <w:tr>
+        <w:tc>
+          <w:tcPr>
+            <w:tcW w:type="dxa" w:w="4320"/>
+          </w:tcPr>
+          <w:p>
+            <w:r>
+              <w:t>ring: peak</w:t>
+            </w:r>
+          </w:p>
+        </w:tc>
+        <w:tc>
+          <w:tcPr>
+            <w:tcW w:type="dxa" w:w="4320"/>
+          </w:tcPr>
+          <w:p>
+            <w:r>
+              <w:t>the most the camera ever had waiting, out of the space it has. Information, not a fault.</w:t>
             </w:r>
           </w:p>
         </w:tc>

</xml_diff>